<commit_message>
Knowledge - 2-Science - fix sources - 11/8/2025
</commit_message>
<xml_diff>
--- a/Knowledge/2-Science/2-Natural Science/1-Physical science/0-Intro to Physical science/3-Wiki Source/Sources.docx
+++ b/Knowledge/2-Science/2-Natural Science/1-Physical science/0-Intro to Physical science/3-Wiki Source/Sources.docx
@@ -80,7 +80,10 @@
         <w:t>Source Platform</w:t>
       </w:r>
       <w:r>
-        <w:t>: Wikipedia (https://www.wikipedia.org)</w:t>
+        <w:t xml:space="preserve">: </w:t>
+      </w:r>
+      <w:r>
+        <w:t>Wikiversity (https://www.wikiversity.org)</w:t>
       </w:r>
       <w:r>
         <w:br/>

</xml_diff>